<commit_message>
Exhibit 20: add measured results from the ~22h continuous run
Real numbers from the live trail (GET /decision/stats + /metrics): ~22h uptime,
~100k labelled verdicts (FIFO-capped, ~100% labelled via feedback), overall
precision 0.996 / recall 0.998 / specificity 0.997; identity 1.000/0.998/1.000;
OT-ICS 0.966/1.000/0.994; 52 Act-layer actions. Validates live accuracy, the
feedback loop, FIFO retention, and restart-persistence.
</commit_message>
<xml_diff>
--- a/exhibits/Exhibit 20 Testing Infrastructure Target Labs.docx
+++ b/exhibits/Exhibit 20 Testing Infrastructure Target Labs.docx
@@ -384,7 +384,226 @@
         <w:pStyle w:val="Heading1"/>
       </w:pPr>
       <w:r>
-        <w:t>5. Significance</w:t>
+        <w:t>5. Measured results from a continuous run</w:t>
+      </w:r>
+    </w:p>
+    <w:p>
+      <w:r>
+        <w:rPr>
+          <w:b w:val="0"/>
+          <w:i w:val="0"/>
+        </w:rPr>
+        <w:t>The labs are not merely demonstrable — they have been run continuously against the live platform. In a representative run recorded July 2026, the platform and both event sources ran for approximately 22 hours without interruption (restart-persistent containers), streaming synthetic identity and OT/ICS events and reporting the injected ground-truth labels back. The following are measured live from the platform's own trail (GET /decision/stats and /decision/metrics) — not re-derived or estimated:</w:t>
+      </w:r>
+    </w:p>
+    <w:tbl>
+      <w:tblPr>
+        <w:tblStyle w:val="LightGrid-Accent1"/>
+        <w:tblW w:type="auto" w:w="0"/>
+        <w:tblLook w:firstColumn="1" w:firstRow="1" w:lastColumn="0" w:lastRow="0" w:noHBand="0" w:noVBand="1" w:val="04A0"/>
+      </w:tblPr>
+      <w:tblGrid>
+        <w:gridCol w:w="4320"/>
+        <w:gridCol w:w="4320"/>
+      </w:tblGrid>
+      <w:tr>
+        <w:tc>
+          <w:tcPr>
+            <w:tcW w:type="dxa" w:w="4320"/>
+          </w:tcPr>
+          <w:p>
+            <w:r>
+              <w:rPr>
+                <w:b/>
+              </w:rPr>
+              <w:t>Quantity</w:t>
+            </w:r>
+          </w:p>
+        </w:tc>
+        <w:tc>
+          <w:tcPr>
+            <w:tcW w:type="dxa" w:w="4320"/>
+          </w:tcPr>
+          <w:p>
+            <w:r>
+              <w:rPr>
+                <w:b/>
+              </w:rPr>
+              <w:t>Value</w:t>
+            </w:r>
+          </w:p>
+        </w:tc>
+      </w:tr>
+      <w:tr>
+        <w:tc>
+          <w:tcPr>
+            <w:tcW w:type="dxa" w:w="4320"/>
+          </w:tcPr>
+          <w:p>
+            <w:r>
+              <w:t>Continuous uptime</w:t>
+            </w:r>
+          </w:p>
+        </w:tc>
+        <w:tc>
+          <w:tcPr>
+            <w:tcW w:type="dxa" w:w="4320"/>
+          </w:tcPr>
+          <w:p>
+            <w:r>
+              <w:t>~22 hours (backend + identity and OT/ICS event sources)</w:t>
+            </w:r>
+          </w:p>
+        </w:tc>
+      </w:tr>
+      <w:tr>
+        <w:tc>
+          <w:tcPr>
+            <w:tcW w:type="dxa" w:w="4320"/>
+          </w:tcPr>
+          <w:p>
+            <w:r>
+              <w:t>Labelled verdicts retained</w:t>
+            </w:r>
+          </w:p>
+        </w:tc>
+        <w:tc>
+          <w:tcPr>
+            <w:tcW w:type="dxa" w:w="4320"/>
+          </w:tcPr>
+          <w:p>
+            <w:r>
+              <w:t>~100,000 — the trail reached its FIFO retention cap; ~100% labelled automatically via the feedback loop</w:t>
+            </w:r>
+          </w:p>
+        </w:tc>
+      </w:tr>
+      <w:tr>
+        <w:tc>
+          <w:tcPr>
+            <w:tcW w:type="dxa" w:w="4320"/>
+          </w:tcPr>
+          <w:p>
+            <w:r>
+              <w:t>Volume by model</w:t>
+            </w:r>
+          </w:p>
+        </w:tc>
+        <w:tc>
+          <w:tcPr>
+            <w:tcW w:type="dxa" w:w="4320"/>
+          </w:tcPr>
+          <w:p>
+            <w:r>
+              <w:t>identity: 66,228 labelled; OT/ICS: 33,787 labelled</w:t>
+            </w:r>
+          </w:p>
+        </w:tc>
+      </w:tr>
+      <w:tr>
+        <w:tc>
+          <w:tcPr>
+            <w:tcW w:type="dxa" w:w="4320"/>
+          </w:tcPr>
+          <w:p>
+            <w:r>
+              <w:t>Overall precision / recall / specificity</w:t>
+            </w:r>
+          </w:p>
+        </w:tc>
+        <w:tc>
+          <w:tcPr>
+            <w:tcW w:type="dxa" w:w="4320"/>
+          </w:tcPr>
+          <w:p>
+            <w:r>
+              <w:t>0.996 / 0.998 / 0.997</w:t>
+            </w:r>
+          </w:p>
+        </w:tc>
+      </w:tr>
+      <w:tr>
+        <w:tc>
+          <w:tcPr>
+            <w:tcW w:type="dxa" w:w="4320"/>
+          </w:tcPr>
+          <w:p>
+            <w:r>
+              <w:t>Identity precision / recall / specificity</w:t>
+            </w:r>
+          </w:p>
+        </w:tc>
+        <w:tc>
+          <w:tcPr>
+            <w:tcW w:type="dxa" w:w="4320"/>
+          </w:tcPr>
+          <w:p>
+            <w:r>
+              <w:t>1.000 / 0.998 / 1.000  (TP 42,098 · FP 0 · FN 84 · TN 24,046)</w:t>
+            </w:r>
+          </w:p>
+        </w:tc>
+      </w:tr>
+      <w:tr>
+        <w:tc>
+          <w:tcPr>
+            <w:tcW w:type="dxa" w:w="4320"/>
+          </w:tcPr>
+          <w:p>
+            <w:r>
+              <w:t>OT/ICS precision / recall / specificity</w:t>
+            </w:r>
+          </w:p>
+        </w:tc>
+        <w:tc>
+          <w:tcPr>
+            <w:tcW w:type="dxa" w:w="4320"/>
+          </w:tcPr>
+          <w:p>
+            <w:r>
+              <w:t>0.966 / 1.000 / 0.994  (TP 5,066 · FP 181 · FN 0 · TN 28,540)</w:t>
+            </w:r>
+          </w:p>
+        </w:tc>
+      </w:tr>
+      <w:tr>
+        <w:tc>
+          <w:tcPr>
+            <w:tcW w:type="dxa" w:w="4320"/>
+          </w:tcPr>
+          <w:p>
+            <w:r>
+              <w:t>Response actions recorded</w:t>
+            </w:r>
+          </w:p>
+        </w:tc>
+        <w:tc>
+          <w:tcPr>
+            <w:tcW w:type="dxa" w:w="4320"/>
+          </w:tcPr>
+          <w:p>
+            <w:r>
+              <w:t>52 (Act layer: log / ticket / webhook)</w:t>
+            </w:r>
+          </w:p>
+        </w:tc>
+      </w:tr>
+    </w:tbl>
+    <w:p>
+      <w:r>
+        <w:rPr>
+          <w:b w:val="0"/>
+          <w:i/>
+        </w:rPr>
+        <w:t>This one run validates several things simultaneously: the detectors' live accuracy against a continuous, labelled stream at scale; the ground-truth feedback loop (which let these metrics be computed directly from the database rather than tallied by hand, as in Exhibit 14); the FIFO retention design (the trail held at its ~100,000-record cap over 22 hours instead of growing without bound); and restart-persistence. It is the testing infrastructure demonstrating the very properties it was built to verify.</w:t>
+      </w:r>
+    </w:p>
+    <w:p>
+      <w:pPr>
+        <w:pStyle w:val="Heading1"/>
+      </w:pPr>
+      <w:r>
+        <w:t>6. Significance</w:t>
       </w:r>
     </w:p>
     <w:p>

</xml_diff>

<commit_message>
Exhibit 20: embed measured-run screenshots + typography pass
- build_exhibit20.py: embed 6 live console/API screenshots, align the metrics
  table to the captured values, and a full formatting pass (justified body,
  navy headings, bold figure labels, tidy tables).
- crop_shots.py + exhibits/evidence/: cropped, chrome-free console + API
  screenshots and the captured metrics (JSON + HTML evidence page).
- capture_live_evidence.py: snapshot live /decision/stats + /metrics to a
  timestamped JSON + a renderable evidence page.
</commit_message>
<xml_diff>
--- a/exhibits/Exhibit 20 Testing Infrastructure Target Labs.docx
+++ b/exhibits/Exhibit 20 Testing Infrastructure Target Labs.docx
@@ -3,28 +3,40 @@
 <w:document xmlns:wpc="http://schemas.microsoft.com/office/word/2010/wordprocessingCanvas" xmlns:mo="http://schemas.microsoft.com/office/mac/office/2008/main" xmlns:mc="http://schemas.openxmlformats.org/markup-compatibility/2006" xmlns:mv="urn:schemas-microsoft-com:mac:vml" xmlns:o="urn:schemas-microsoft-com:office:office" xmlns:r="http://schemas.openxmlformats.org/officeDocument/2006/relationships" xmlns:m="http://schemas.openxmlformats.org/officeDocument/2006/math" xmlns:v="urn:schemas-microsoft-com:vml" xmlns:wp14="http://schemas.microsoft.com/office/word/2010/wordprocessingDrawing" xmlns:wp="http://schemas.openxmlformats.org/drawingml/2006/wordprocessingDrawing" xmlns:w10="urn:schemas-microsoft-com:office:word" xmlns:w="http://schemas.openxmlformats.org/wordprocessingml/2006/main" xmlns:w14="http://schemas.microsoft.com/office/word/2010/wordml" xmlns:wpg="http://schemas.microsoft.com/office/word/2010/wordprocessingGroup" xmlns:wpi="http://schemas.microsoft.com/office/word/2010/wordprocessingInk" xmlns:wne="http://schemas.microsoft.com/office/word/2006/wordml" xmlns:wps="http://schemas.microsoft.com/office/word/2010/wordprocessingShape" mc:Ignorable="w14 wp14">
   <w:body>
     <w:p>
+      <w:pPr>
+        <w:spacing w:after="40"/>
+        <w:jc w:val="center"/>
+      </w:pPr>
       <w:r>
         <w:rPr>
           <w:b/>
-          <w:sz w:val="30"/>
+          <w:color w:val="1F3864"/>
+          <w:sz w:val="32"/>
         </w:rPr>
-        <w:t>Exhibit 20: Testing Infrastructure — Target Labs for Continuous Validation</w:t>
+        <w:t>Exhibit 20 — Testing Infrastructure: Target Labs for Continuous Validation</w:t>
       </w:r>
     </w:p>
     <w:p>
+      <w:pPr>
+        <w:spacing w:after="40"/>
+        <w:jc w:val="center"/>
+      </w:pPr>
       <w:r>
         <w:rPr>
           <w:b/>
-          <w:i w:val="0"/>
         </w:rPr>
         <w:t>Petitioner: Samuel Gbli Tetteh</w:t>
       </w:r>
     </w:p>
     <w:p>
+      <w:pPr>
+        <w:spacing w:after="200"/>
+        <w:jc w:val="center"/>
+      </w:pPr>
       <w:r>
         <w:rPr>
-          <w:b w:val="0"/>
           <w:i/>
+          <w:sz w:val="21"/>
         </w:rPr>
         <w:t>NIW Proposed Endeavor — the purpose-built test harnesses I created to continuously and reproducibly validate the detection and scanning systems, now themselves released as open, standalone tools.</w:t>
       </w:r>
@@ -58,6 +70,7 @@
       <w:tblPr>
         <w:tblStyle w:val="LightGrid-Accent1"/>
         <w:tblW w:type="auto" w:w="0"/>
+        <w:tblLayout w:type="autofit"/>
         <w:tblLook w:firstColumn="1" w:firstRow="1" w:lastColumn="0" w:lastRow="0" w:noHBand="0" w:noVBand="1" w:val="04A0"/>
       </w:tblPr>
       <w:tblGrid>
@@ -74,6 +87,7 @@
             <w:r>
               <w:rPr>
                 <w:b/>
+                <w:sz w:val="20"/>
               </w:rPr>
               <w:t>Lab</w:t>
             </w:r>
@@ -87,6 +101,7 @@
             <w:r>
               <w:rPr>
                 <w:b/>
+                <w:sz w:val="20"/>
               </w:rPr>
               <w:t>What it does</w:t>
             </w:r>
@@ -100,6 +115,7 @@
             <w:r>
               <w:rPr>
                 <w:b/>
+                <w:sz w:val="20"/>
               </w:rPr>
               <w:t>Validates</w:t>
             </w:r>
@@ -112,7 +128,13 @@
             <w:tcW w:type="dxa" w:w="2880"/>
           </w:tcPr>
           <w:p>
+            <w:pPr>
+              <w:spacing w:after="40" w:line="240" w:lineRule="auto"/>
+            </w:pPr>
             <w:r>
+              <w:rPr>
+                <w:sz w:val="20"/>
+              </w:rPr>
               <w:t>Live Target Lab</w:t>
             </w:r>
           </w:p>
@@ -122,7 +144,13 @@
             <w:tcW w:type="dxa" w:w="2880"/>
           </w:tcPr>
           <w:p>
+            <w:pPr>
+              <w:spacing w:after="40" w:line="240" w:lineRule="auto"/>
+            </w:pPr>
             <w:r>
+              <w:rPr>
+                <w:sz w:val="20"/>
+              </w:rPr>
               <w:t>Two standing services that continuously stream synthetic-but-realistic identity login events and OT/ICS sensor readings to the live detection APIs (~15% intentionally malicious), and report the KNOWN injected label back through the feedback channel.</w:t>
             </w:r>
           </w:p>
@@ -132,7 +160,13 @@
             <w:tcW w:type="dxa" w:w="2880"/>
           </w:tcPr>
           <w:p>
+            <w:pPr>
+              <w:spacing w:after="40" w:line="240" w:lineRule="auto"/>
+            </w:pPr>
             <w:r>
+              <w:rPr>
+                <w:sz w:val="20"/>
+              </w:rPr>
               <w:t>The identity + OT/ICS detectors and the decision layer — end to end, live.</w:t>
             </w:r>
           </w:p>
@@ -144,7 +178,13 @@
             <w:tcW w:type="dxa" w:w="2880"/>
           </w:tcPr>
           <w:p>
+            <w:pPr>
+              <w:spacing w:after="40" w:line="240" w:lineRule="auto"/>
+            </w:pPr>
             <w:r>
+              <w:rPr>
+                <w:sz w:val="20"/>
+              </w:rPr>
               <w:t>Cloud Target Lab</w:t>
             </w:r>
           </w:p>
@@ -154,7 +194,13 @@
             <w:tcW w:type="dxa" w:w="2880"/>
           </w:tcPr>
           <w:p>
+            <w:pPr>
+              <w:spacing w:after="40" w:line="240" w:lineRule="auto"/>
+            </w:pPr>
             <w:r>
+              <w:rPr>
+                <w:sz w:val="20"/>
+              </w:rPr>
               <w:t>Stands up a disposable fake-AWS (LocalStack) seeded with a deliberate mix of correctly-configured and intentionally-insecure resources (public S3 bucket, SSH-open security group, admin-* IAM user, etc.).</w:t>
             </w:r>
           </w:p>
@@ -164,13 +210,24 @@
             <w:tcW w:type="dxa" w:w="2880"/>
           </w:tcPr>
           <w:p>
+            <w:pPr>
+              <w:spacing w:after="40" w:line="240" w:lineRule="auto"/>
+            </w:pPr>
             <w:r>
+              <w:rPr>
+                <w:sz w:val="20"/>
+              </w:rPr>
               <w:t>The cloud security scanner / control auditing — with known ground-truth findings to detect.</w:t>
             </w:r>
           </w:p>
         </w:tc>
       </w:tr>
     </w:tbl>
+    <w:p>
+      <w:pPr>
+        <w:spacing w:after="40"/>
+      </w:pPr>
+    </w:p>
     <w:p>
       <w:pPr>
         <w:pStyle w:val="Heading1"/>
@@ -232,6 +289,7 @@
       <w:tblPr>
         <w:tblStyle w:val="LightGrid-Accent1"/>
         <w:tblW w:type="auto" w:w="0"/>
+        <w:tblLayout w:type="autofit"/>
         <w:tblLook w:firstColumn="1" w:firstRow="1" w:lastColumn="0" w:lastRow="0" w:noHBand="0" w:noVBand="1" w:val="04A0"/>
       </w:tblPr>
       <w:tblGrid>
@@ -249,6 +307,7 @@
             <w:r>
               <w:rPr>
                 <w:b/>
+                <w:sz w:val="20"/>
               </w:rPr>
               <w:t>Lab</w:t>
             </w:r>
@@ -262,6 +321,7 @@
             <w:r>
               <w:rPr>
                 <w:b/>
+                <w:sz w:val="20"/>
               </w:rPr>
               <w:t>GitHub</w:t>
             </w:r>
@@ -275,6 +335,7 @@
             <w:r>
               <w:rPr>
                 <w:b/>
+                <w:sz w:val="20"/>
               </w:rPr>
               <w:t>Docker (GHCR)</w:t>
             </w:r>
@@ -288,6 +349,7 @@
             <w:r>
               <w:rPr>
                 <w:b/>
+                <w:sz w:val="20"/>
               </w:rPr>
               <w:t>Hugging Face</w:t>
             </w:r>
@@ -300,7 +362,13 @@
             <w:tcW w:type="dxa" w:w="2160"/>
           </w:tcPr>
           <w:p>
+            <w:pPr>
+              <w:spacing w:after="40" w:line="240" w:lineRule="auto"/>
+            </w:pPr>
             <w:r>
+              <w:rPr>
+                <w:sz w:val="20"/>
+              </w:rPr>
               <w:t>Live Target Lab</w:t>
             </w:r>
           </w:p>
@@ -310,7 +378,13 @@
             <w:tcW w:type="dxa" w:w="2160"/>
           </w:tcPr>
           <w:p>
+            <w:pPr>
+              <w:spacing w:after="40" w:line="240" w:lineRule="auto"/>
+            </w:pPr>
             <w:r>
+              <w:rPr>
+                <w:sz w:val="20"/>
+              </w:rPr>
               <w:t>github.com/samuelgtetteh/live-target-lab (Release v0.1)</w:t>
             </w:r>
           </w:p>
@@ -320,7 +394,13 @@
             <w:tcW w:type="dxa" w:w="2160"/>
           </w:tcPr>
           <w:p>
+            <w:pPr>
+              <w:spacing w:after="40" w:line="240" w:lineRule="auto"/>
+            </w:pPr>
             <w:r>
+              <w:rPr>
+                <w:sz w:val="20"/>
+              </w:rPr>
               <w:t>ghcr.io/samuelgtetteh/live-target-lab</w:t>
             </w:r>
           </w:p>
@@ -330,7 +410,13 @@
             <w:tcW w:type="dxa" w:w="2160"/>
           </w:tcPr>
           <w:p>
+            <w:pPr>
+              <w:spacing w:after="40" w:line="240" w:lineRule="auto"/>
+            </w:pPr>
             <w:r>
+              <w:rPr>
+                <w:sz w:val="20"/>
+              </w:rPr>
               <w:t>dataset stetteh/live-target-lab-events; Space stetteh/live-target-lab</w:t>
             </w:r>
           </w:p>
@@ -342,7 +428,13 @@
             <w:tcW w:type="dxa" w:w="2160"/>
           </w:tcPr>
           <w:p>
+            <w:pPr>
+              <w:spacing w:after="40" w:line="240" w:lineRule="auto"/>
+            </w:pPr>
             <w:r>
+              <w:rPr>
+                <w:sz w:val="20"/>
+              </w:rPr>
               <w:t>Cloud Target Lab</w:t>
             </w:r>
           </w:p>
@@ -352,7 +444,13 @@
             <w:tcW w:type="dxa" w:w="2160"/>
           </w:tcPr>
           <w:p>
+            <w:pPr>
+              <w:spacing w:after="40" w:line="240" w:lineRule="auto"/>
+            </w:pPr>
             <w:r>
+              <w:rPr>
+                <w:sz w:val="20"/>
+              </w:rPr>
               <w:t>github.com/samuelgtetteh/cloud-target-lab (Release v0.1)</w:t>
             </w:r>
           </w:p>
@@ -362,7 +460,13 @@
             <w:tcW w:type="dxa" w:w="2160"/>
           </w:tcPr>
           <w:p>
+            <w:pPr>
+              <w:spacing w:after="40" w:line="240" w:lineRule="auto"/>
+            </w:pPr>
             <w:r>
+              <w:rPr>
+                <w:sz w:val="20"/>
+              </w:rPr>
               <w:t>ghcr.io/samuelgtetteh/cloud-target-lab</w:t>
             </w:r>
           </w:p>
@@ -372,13 +476,24 @@
             <w:tcW w:type="dxa" w:w="2160"/>
           </w:tcPr>
           <w:p>
+            <w:pPr>
+              <w:spacing w:after="40" w:line="240" w:lineRule="auto"/>
+            </w:pPr>
             <w:r>
+              <w:rPr>
+                <w:sz w:val="20"/>
+              </w:rPr>
               <w:t>dataset stetteh/cloud-target-lab-scenarios; Space stetteh/cloud-target-lab</w:t>
             </w:r>
           </w:p>
         </w:tc>
       </w:tr>
     </w:tbl>
+    <w:p>
+      <w:pPr>
+        <w:spacing w:after="40"/>
+      </w:pPr>
+    </w:p>
     <w:p>
       <w:pPr>
         <w:pStyle w:val="Heading1"/>
@@ -400,6 +515,7 @@
       <w:tblPr>
         <w:tblStyle w:val="LightGrid-Accent1"/>
         <w:tblW w:type="auto" w:w="0"/>
+        <w:tblLayout w:type="autofit"/>
         <w:tblLook w:firstColumn="1" w:firstRow="1" w:lastColumn="0" w:lastRow="0" w:noHBand="0" w:noVBand="1" w:val="04A0"/>
       </w:tblPr>
       <w:tblGrid>
@@ -415,6 +531,7 @@
             <w:r>
               <w:rPr>
                 <w:b/>
+                <w:sz w:val="20"/>
               </w:rPr>
               <w:t>Quantity</w:t>
             </w:r>
@@ -428,6 +545,7 @@
             <w:r>
               <w:rPr>
                 <w:b/>
+                <w:sz w:val="20"/>
               </w:rPr>
               <w:t>Value</w:t>
             </w:r>
@@ -440,7 +558,13 @@
             <w:tcW w:type="dxa" w:w="4320"/>
           </w:tcPr>
           <w:p>
+            <w:pPr>
+              <w:spacing w:after="40" w:line="240" w:lineRule="auto"/>
+            </w:pPr>
             <w:r>
+              <w:rPr>
+                <w:sz w:val="20"/>
+              </w:rPr>
               <w:t>Continuous uptime</w:t>
             </w:r>
           </w:p>
@@ -450,8 +574,14 @@
             <w:tcW w:type="dxa" w:w="4320"/>
           </w:tcPr>
           <w:p>
+            <w:pPr>
+              <w:spacing w:after="40" w:line="240" w:lineRule="auto"/>
+            </w:pPr>
             <w:r>
-              <w:t>~22 hours (backend + identity and OT/ICS event sources)</w:t>
+              <w:rPr>
+                <w:sz w:val="20"/>
+              </w:rPr>
+              <w:t>~22 hours (backend + identity and OT/ICS event sources, all restart-persistent containers)</w:t>
             </w:r>
           </w:p>
         </w:tc>
@@ -462,7 +592,13 @@
             <w:tcW w:type="dxa" w:w="4320"/>
           </w:tcPr>
           <w:p>
+            <w:pPr>
+              <w:spacing w:after="40" w:line="240" w:lineRule="auto"/>
+            </w:pPr>
             <w:r>
+              <w:rPr>
+                <w:sz w:val="20"/>
+              </w:rPr>
               <w:t>Labelled verdicts retained</w:t>
             </w:r>
           </w:p>
@@ -472,8 +608,14 @@
             <w:tcW w:type="dxa" w:w="4320"/>
           </w:tcPr>
           <w:p>
+            <w:pPr>
+              <w:spacing w:after="40" w:line="240" w:lineRule="auto"/>
+            </w:pPr>
             <w:r>
-              <w:t>~100,000 — the trail reached its FIFO retention cap; ~100% labelled automatically via the feedback loop</w:t>
+              <w:rPr>
+                <w:sz w:val="20"/>
+              </w:rPr>
+              <w:t>100,005 of 100,009 — the trail reached its 100,000-record FIFO retention cap; ~100% labelled automatically via the feedback loop</w:t>
             </w:r>
           </w:p>
         </w:tc>
@@ -484,7 +626,13 @@
             <w:tcW w:type="dxa" w:w="4320"/>
           </w:tcPr>
           <w:p>
+            <w:pPr>
+              <w:spacing w:after="40" w:line="240" w:lineRule="auto"/>
+            </w:pPr>
             <w:r>
+              <w:rPr>
+                <w:sz w:val="20"/>
+              </w:rPr>
               <w:t>Volume by model</w:t>
             </w:r>
           </w:p>
@@ -494,8 +642,14 @@
             <w:tcW w:type="dxa" w:w="4320"/>
           </w:tcPr>
           <w:p>
+            <w:pPr>
+              <w:spacing w:after="40" w:line="240" w:lineRule="auto"/>
+            </w:pPr>
             <w:r>
-              <w:t>identity: 66,228 labelled; OT/ICS: 33,787 labelled</w:t>
+              <w:rPr>
+                <w:sz w:val="20"/>
+              </w:rPr>
+              <w:t>identity: 66,201 labelled; OT/ICS: 33,824 labelled</w:t>
             </w:r>
           </w:p>
         </w:tc>
@@ -506,7 +660,13 @@
             <w:tcW w:type="dxa" w:w="4320"/>
           </w:tcPr>
           <w:p>
+            <w:pPr>
+              <w:spacing w:after="40" w:line="240" w:lineRule="auto"/>
+            </w:pPr>
             <w:r>
+              <w:rPr>
+                <w:sz w:val="20"/>
+              </w:rPr>
               <w:t>Overall precision / recall / specificity</w:t>
             </w:r>
           </w:p>
@@ -516,8 +676,14 @@
             <w:tcW w:type="dxa" w:w="4320"/>
           </w:tcPr>
           <w:p>
+            <w:pPr>
+              <w:spacing w:after="40" w:line="240" w:lineRule="auto"/>
+            </w:pPr>
             <w:r>
-              <w:t>0.996 / 0.998 / 0.997</w:t>
+              <w:rPr>
+                <w:sz w:val="20"/>
+              </w:rPr>
+              <w:t>0.9961 / 0.9982 / 0.9965  (TP 47,083 · FP 183 · FN 84 · TN 52,666)</w:t>
             </w:r>
           </w:p>
         </w:tc>
@@ -528,7 +694,13 @@
             <w:tcW w:type="dxa" w:w="4320"/>
           </w:tcPr>
           <w:p>
+            <w:pPr>
+              <w:spacing w:after="40" w:line="240" w:lineRule="auto"/>
+            </w:pPr>
             <w:r>
+              <w:rPr>
+                <w:sz w:val="20"/>
+              </w:rPr>
               <w:t>Identity precision / recall / specificity</w:t>
             </w:r>
           </w:p>
@@ -538,8 +710,14 @@
             <w:tcW w:type="dxa" w:w="4320"/>
           </w:tcPr>
           <w:p>
+            <w:pPr>
+              <w:spacing w:after="40" w:line="240" w:lineRule="auto"/>
+            </w:pPr>
             <w:r>
-              <w:t>1.000 / 0.998 / 1.000  (TP 42,098 · FP 0 · FN 84 · TN 24,046)</w:t>
+              <w:rPr>
+                <w:sz w:val="20"/>
+              </w:rPr>
+              <w:t>1.000 / 0.998 / 1.000  (TP 42,015 · FP 0 · FN 84 · TN 24,102)</w:t>
             </w:r>
           </w:p>
         </w:tc>
@@ -550,7 +728,13 @@
             <w:tcW w:type="dxa" w:w="4320"/>
           </w:tcPr>
           <w:p>
+            <w:pPr>
+              <w:spacing w:after="40" w:line="240" w:lineRule="auto"/>
+            </w:pPr>
             <w:r>
+              <w:rPr>
+                <w:sz w:val="20"/>
+              </w:rPr>
               <w:t>OT/ICS precision / recall / specificity</w:t>
             </w:r>
           </w:p>
@@ -560,8 +744,14 @@
             <w:tcW w:type="dxa" w:w="4320"/>
           </w:tcPr>
           <w:p>
+            <w:pPr>
+              <w:spacing w:after="40" w:line="240" w:lineRule="auto"/>
+            </w:pPr>
             <w:r>
-              <w:t>0.966 / 1.000 / 0.994  (TP 5,066 · FP 181 · FN 0 · TN 28,540)</w:t>
+              <w:rPr>
+                <w:sz w:val="20"/>
+              </w:rPr>
+              <w:t>0.965 / 1.000 / 0.994  (TP 5,070 · FP 183 · FN 0 · TN 28,571)</w:t>
             </w:r>
           </w:p>
         </w:tc>
@@ -572,8 +762,14 @@
             <w:tcW w:type="dxa" w:w="4320"/>
           </w:tcPr>
           <w:p>
+            <w:pPr>
+              <w:spacing w:after="40" w:line="240" w:lineRule="auto"/>
+            </w:pPr>
             <w:r>
-              <w:t>Response actions recorded</w:t>
+              <w:rPr>
+                <w:sz w:val="20"/>
+              </w:rPr>
+              <w:t>Response actions</w:t>
             </w:r>
           </w:p>
         </w:tc>
@@ -582,13 +778,33 @@
             <w:tcW w:type="dxa" w:w="4320"/>
           </w:tcPr>
           <w:p>
+            <w:pPr>
+              <w:spacing w:after="40" w:line="240" w:lineRule="auto"/>
+            </w:pPr>
             <w:r>
-              <w:t>52 (Act layer: log / ticket / webhook)</w:t>
+              <w:rPr>
+                <w:sz w:val="20"/>
+              </w:rPr>
+              <w:t>recorded by the Act layer (log / step-up-auth / webhook stubs) — visible in the console's Response Actions panel</w:t>
             </w:r>
           </w:p>
         </w:tc>
       </w:tr>
     </w:tbl>
+    <w:p>
+      <w:pPr>
+        <w:spacing w:after="40"/>
+      </w:pPr>
+    </w:p>
+    <w:p>
+      <w:r>
+        <w:rPr>
+          <w:b w:val="0"/>
+          <w:i w:val="0"/>
+        </w:rPr>
+        <w:t>These figures are shown directly in Section 6 below, captured from the running console and its own API endpoints.</w:t>
+      </w:r>
+    </w:p>
     <w:p>
       <w:r>
         <w:rPr>
@@ -603,7 +819,390 @@
         <w:pStyle w:val="Heading1"/>
       </w:pPr>
       <w:r>
-        <w:t>6. Significance</w:t>
+        <w:t>6. Screenshot evidence (captured from the live system)</w:t>
+      </w:r>
+    </w:p>
+    <w:p>
+      <w:r>
+        <w:rPr>
+          <w:b w:val="0"/>
+          <w:i w:val="0"/>
+        </w:rPr>
+        <w:t>The following screenshots were captured on July 17, 2026 directly from the running platform at the ~22-hour mark; they are the source of the numbers in Section 5. Figures 1–2 are the live Monitor console. Figures 3–6 are the platform's own JSON API responses (the ground truth behind the dashboard, each shown with its endpoint URL) so the results can be read raw and independently verified.</w:t>
+      </w:r>
+    </w:p>
+    <w:p>
+      <w:pPr>
+        <w:keepNext/>
+        <w:spacing w:before="160" w:after="40"/>
+        <w:jc w:val="center"/>
+      </w:pPr>
+      <w:r>
+        <w:drawing>
+          <wp:inline xmlns:a="http://schemas.openxmlformats.org/drawingml/2006/main" xmlns:pic="http://schemas.openxmlformats.org/drawingml/2006/picture">
+            <wp:extent cx="5760720" cy="2742343"/>
+            <wp:docPr id="1" name="Picture 1"/>
+            <wp:cNvGraphicFramePr>
+              <a:graphicFrameLocks noChangeAspect="1"/>
+            </wp:cNvGraphicFramePr>
+            <a:graphic>
+              <a:graphicData uri="http://schemas.openxmlformats.org/drawingml/2006/picture">
+                <pic:pic>
+                  <pic:nvPicPr>
+                    <pic:cNvPr id="0" name="fig1_monitor_1031.png"/>
+                    <pic:cNvPicPr/>
+                  </pic:nvPicPr>
+                  <pic:blipFill>
+                    <a:blip r:embed="rId9"/>
+                    <a:stretch>
+                      <a:fillRect/>
+                    </a:stretch>
+                  </pic:blipFill>
+                  <pic:spPr>
+                    <a:xfrm>
+                      <a:off x="0" y="0"/>
+                      <a:ext cx="5760720" cy="2742343"/>
+                    </a:xfrm>
+                    <a:prstGeom prst="rect"/>
+                  </pic:spPr>
+                </pic:pic>
+              </a:graphicData>
+            </a:graphic>
+          </wp:inline>
+        </w:drawing>
+      </w:r>
+    </w:p>
+    <w:p>
+      <w:pPr>
+        <w:spacing w:after="240" w:line="240" w:lineRule="auto"/>
+        <w:jc w:val="left"/>
+      </w:pPr>
+      <w:r>
+        <w:rPr>
+          <w:b/>
+          <w:sz w:val="18"/>
+        </w:rPr>
+        <w:t xml:space="preserve">Figure 1 — </w:t>
+      </w:r>
+      <w:r>
+        <w:rPr>
+          <w:i/>
+          <w:sz w:val="18"/>
+        </w:rPr>
+        <w:t>Live Monitor console at 10:31:41 (100,042 events). Per-model panels: Identity 66,239 processed, precision 100.0% / recall 99.8%; OT/ICS 33,801 processed, precision 96.5% / recall 100.0%. The live decision feed, alert queue, and recorded response actions are all visible — the full Record → Decide → Act → alert pipeline running end to end.</w:t>
+      </w:r>
+    </w:p>
+    <w:p>
+      <w:pPr>
+        <w:keepNext/>
+        <w:spacing w:before="160" w:after="40"/>
+        <w:jc w:val="center"/>
+      </w:pPr>
+      <w:r>
+        <w:drawing>
+          <wp:inline xmlns:a="http://schemas.openxmlformats.org/drawingml/2006/main" xmlns:pic="http://schemas.openxmlformats.org/drawingml/2006/picture">
+            <wp:extent cx="5760720" cy="2742343"/>
+            <wp:docPr id="2" name="Picture 2"/>
+            <wp:cNvGraphicFramePr>
+              <a:graphicFrameLocks noChangeAspect="1"/>
+            </wp:cNvGraphicFramePr>
+            <a:graphic>
+              <a:graphicData uri="http://schemas.openxmlformats.org/drawingml/2006/picture">
+                <pic:pic>
+                  <pic:nvPicPr>
+                    <pic:cNvPr id="0" name="fig2_monitor_1032.png"/>
+                    <pic:cNvPicPr/>
+                  </pic:nvPicPr>
+                  <pic:blipFill>
+                    <a:blip r:embed="rId10"/>
+                    <a:stretch>
+                      <a:fillRect/>
+                    </a:stretch>
+                  </pic:blipFill>
+                  <pic:spPr>
+                    <a:xfrm>
+                      <a:off x="0" y="0"/>
+                      <a:ext cx="5760720" cy="2742343"/>
+                    </a:xfrm>
+                    <a:prstGeom prst="rect"/>
+                  </pic:spPr>
+                </pic:pic>
+              </a:graphicData>
+            </a:graphic>
+          </wp:inline>
+        </w:drawing>
+      </w:r>
+    </w:p>
+    <w:p>
+      <w:pPr>
+        <w:spacing w:after="240" w:line="240" w:lineRule="auto"/>
+        <w:jc w:val="left"/>
+      </w:pPr>
+      <w:r>
+        <w:rPr>
+          <w:b/>
+          <w:sz w:val="18"/>
+        </w:rPr>
+        <w:t xml:space="preserve">Figure 2 — </w:t>
+      </w:r>
+      <w:r>
+        <w:rPr>
+          <w:i/>
+          <w:sz w:val="18"/>
+        </w:rPr>
+        <w:t>The same console 49 seconds later at 10:32:30: the event counter has advanced (100,042 → 100,096; Identity 66,239 → 66,278; OT/ICS 33,801 → 33,816) and new decisions have streamed in — demonstrating the system is genuinely live and continuously processing, not a static snapshot.</w:t>
+      </w:r>
+    </w:p>
+    <w:p>
+      <w:pPr>
+        <w:keepNext/>
+        <w:spacing w:before="160" w:after="40"/>
+        <w:jc w:val="center"/>
+      </w:pPr>
+      <w:r>
+        <w:drawing>
+          <wp:inline xmlns:a="http://schemas.openxmlformats.org/drawingml/2006/main" xmlns:pic="http://schemas.openxmlformats.org/drawingml/2006/picture">
+            <wp:extent cx="5760720" cy="432497"/>
+            <wp:docPr id="3" name="Picture 3"/>
+            <wp:cNvGraphicFramePr>
+              <a:graphicFrameLocks noChangeAspect="1"/>
+            </wp:cNvGraphicFramePr>
+            <a:graphic>
+              <a:graphicData uri="http://schemas.openxmlformats.org/drawingml/2006/picture">
+                <pic:pic>
+                  <pic:nvPicPr>
+                    <pic:cNvPr id="0" name="fig3_stats.png"/>
+                    <pic:cNvPicPr/>
+                  </pic:nvPicPr>
+                  <pic:blipFill>
+                    <a:blip r:embed="rId11"/>
+                    <a:stretch>
+                      <a:fillRect/>
+                    </a:stretch>
+                  </pic:blipFill>
+                  <pic:spPr>
+                    <a:xfrm>
+                      <a:off x="0" y="0"/>
+                      <a:ext cx="5760720" cy="432497"/>
+                    </a:xfrm>
+                    <a:prstGeom prst="rect"/>
+                  </pic:spPr>
+                </pic:pic>
+              </a:graphicData>
+            </a:graphic>
+          </wp:inline>
+        </w:drawing>
+      </w:r>
+    </w:p>
+    <w:p>
+      <w:pPr>
+        <w:spacing w:after="240" w:line="240" w:lineRule="auto"/>
+        <w:jc w:val="left"/>
+      </w:pPr>
+      <w:r>
+        <w:rPr>
+          <w:b/>
+          <w:sz w:val="18"/>
+        </w:rPr>
+        <w:t xml:space="preserve">Figure 3 — </w:t>
+      </w:r>
+      <w:r>
+        <w:rPr>
+          <w:i/>
+          <w:sz w:val="18"/>
+        </w:rPr>
+        <w:t>Raw GET /decision/stats: verdicts 100,009, labeled 100,005, by model (ics 33,813 / identity 66,194 / scan 2), retention cap max_verdicts 100,000. Confirms the FIFO retention design is holding the trail at its cap over the long run.</w:t>
+      </w:r>
+    </w:p>
+    <w:p>
+      <w:pPr>
+        <w:keepNext/>
+        <w:spacing w:before="160" w:after="40"/>
+        <w:jc w:val="center"/>
+      </w:pPr>
+      <w:r>
+        <w:drawing>
+          <wp:inline xmlns:a="http://schemas.openxmlformats.org/drawingml/2006/main" xmlns:pic="http://schemas.openxmlformats.org/drawingml/2006/picture">
+            <wp:extent cx="5760720" cy="607736"/>
+            <wp:docPr id="4" name="Picture 4"/>
+            <wp:cNvGraphicFramePr>
+              <a:graphicFrameLocks noChangeAspect="1"/>
+            </wp:cNvGraphicFramePr>
+            <a:graphic>
+              <a:graphicData uri="http://schemas.openxmlformats.org/drawingml/2006/picture">
+                <pic:pic>
+                  <pic:nvPicPr>
+                    <pic:cNvPr id="0" name="fig4_metrics_all.png"/>
+                    <pic:cNvPicPr/>
+                  </pic:nvPicPr>
+                  <pic:blipFill>
+                    <a:blip r:embed="rId12"/>
+                    <a:stretch>
+                      <a:fillRect/>
+                    </a:stretch>
+                  </pic:blipFill>
+                  <pic:spPr>
+                    <a:xfrm>
+                      <a:off x="0" y="0"/>
+                      <a:ext cx="5760720" cy="607736"/>
+                    </a:xfrm>
+                    <a:prstGeom prst="rect"/>
+                  </pic:spPr>
+                </pic:pic>
+              </a:graphicData>
+            </a:graphic>
+          </wp:inline>
+        </w:drawing>
+      </w:r>
+    </w:p>
+    <w:p>
+      <w:pPr>
+        <w:spacing w:after="240" w:line="240" w:lineRule="auto"/>
+        <w:jc w:val="left"/>
+      </w:pPr>
+      <w:r>
+        <w:rPr>
+          <w:b/>
+          <w:sz w:val="18"/>
+        </w:rPr>
+        <w:t xml:space="preserve">Figure 4 — </w:t>
+      </w:r>
+      <w:r>
+        <w:rPr>
+          <w:i/>
+          <w:sz w:val="18"/>
+        </w:rPr>
+        <w:t>Raw GET /decision/metrics (all models): TP 47,083 · FP 183 · FN 84 · TN 52,666, precision 0.9961, recall 0.9982, specificity 0.9965, accuracy 0.9973 — computed by the platform from its own ground-truth-labelled trail.</w:t>
+      </w:r>
+    </w:p>
+    <w:p>
+      <w:pPr>
+        <w:keepNext/>
+        <w:spacing w:before="160" w:after="40"/>
+        <w:jc w:val="center"/>
+      </w:pPr>
+      <w:r>
+        <w:drawing>
+          <wp:inline xmlns:a="http://schemas.openxmlformats.org/drawingml/2006/main" xmlns:pic="http://schemas.openxmlformats.org/drawingml/2006/picture">
+            <wp:extent cx="5760720" cy="579881"/>
+            <wp:docPr id="5" name="Picture 5"/>
+            <wp:cNvGraphicFramePr>
+              <a:graphicFrameLocks noChangeAspect="1"/>
+            </wp:cNvGraphicFramePr>
+            <a:graphic>
+              <a:graphicData uri="http://schemas.openxmlformats.org/drawingml/2006/picture">
+                <pic:pic>
+                  <pic:nvPicPr>
+                    <pic:cNvPr id="0" name="fig5_metrics_identity.png"/>
+                    <pic:cNvPicPr/>
+                  </pic:nvPicPr>
+                  <pic:blipFill>
+                    <a:blip r:embed="rId13"/>
+                    <a:stretch>
+                      <a:fillRect/>
+                    </a:stretch>
+                  </pic:blipFill>
+                  <pic:spPr>
+                    <a:xfrm>
+                      <a:off x="0" y="0"/>
+                      <a:ext cx="5760720" cy="579881"/>
+                    </a:xfrm>
+                    <a:prstGeom prst="rect"/>
+                  </pic:spPr>
+                </pic:pic>
+              </a:graphicData>
+            </a:graphic>
+          </wp:inline>
+        </w:drawing>
+      </w:r>
+    </w:p>
+    <w:p>
+      <w:pPr>
+        <w:spacing w:after="240" w:line="240" w:lineRule="auto"/>
+        <w:jc w:val="left"/>
+      </w:pPr>
+      <w:r>
+        <w:rPr>
+          <w:b/>
+          <w:sz w:val="18"/>
+        </w:rPr>
+        <w:t xml:space="preserve">Figure 5 — </w:t>
+      </w:r>
+      <w:r>
+        <w:rPr>
+          <w:i/>
+          <w:sz w:val="18"/>
+        </w:rPr>
+        <w:t>Raw GET /decision/metrics?model=identity: TP 42,015 · FP 0 · FN 84 · TN 24,102, precision 1.000, recall 0.998, specificity 1.000 — zero false positives over ~66,000 labelled identity events.</w:t>
+      </w:r>
+    </w:p>
+    <w:p>
+      <w:pPr>
+        <w:keepNext/>
+        <w:spacing w:before="160" w:after="40"/>
+        <w:jc w:val="center"/>
+      </w:pPr>
+      <w:r>
+        <w:drawing>
+          <wp:inline xmlns:a="http://schemas.openxmlformats.org/drawingml/2006/main" xmlns:pic="http://schemas.openxmlformats.org/drawingml/2006/picture">
+            <wp:extent cx="5760720" cy="726500"/>
+            <wp:docPr id="6" name="Picture 6"/>
+            <wp:cNvGraphicFramePr>
+              <a:graphicFrameLocks noChangeAspect="1"/>
+            </wp:cNvGraphicFramePr>
+            <a:graphic>
+              <a:graphicData uri="http://schemas.openxmlformats.org/drawingml/2006/picture">
+                <pic:pic>
+                  <pic:nvPicPr>
+                    <pic:cNvPr id="0" name="fig6_metrics_ics.png"/>
+                    <pic:cNvPicPr/>
+                  </pic:nvPicPr>
+                  <pic:blipFill>
+                    <a:blip r:embed="rId14"/>
+                    <a:stretch>
+                      <a:fillRect/>
+                    </a:stretch>
+                  </pic:blipFill>
+                  <pic:spPr>
+                    <a:xfrm>
+                      <a:off x="0" y="0"/>
+                      <a:ext cx="5760720" cy="726500"/>
+                    </a:xfrm>
+                    <a:prstGeom prst="rect"/>
+                  </pic:spPr>
+                </pic:pic>
+              </a:graphicData>
+            </a:graphic>
+          </wp:inline>
+        </w:drawing>
+      </w:r>
+    </w:p>
+    <w:p>
+      <w:pPr>
+        <w:spacing w:after="240" w:line="240" w:lineRule="auto"/>
+        <w:jc w:val="left"/>
+      </w:pPr>
+      <w:r>
+        <w:rPr>
+          <w:b/>
+          <w:sz w:val="18"/>
+        </w:rPr>
+        <w:t xml:space="preserve">Figure 6 — </w:t>
+      </w:r>
+      <w:r>
+        <w:rPr>
+          <w:i/>
+          <w:sz w:val="18"/>
+        </w:rPr>
+        <w:t>Raw GET /decision/metrics?model=ics: TP 5,070 · FP 183 · FN 0 · TN 28,571, precision 0.965, recall 1.000, specificity 0.994 — zero missed attacks over ~33,800 labelled OT/ICS readings.</w:t>
+      </w:r>
+    </w:p>
+    <w:p>
+      <w:pPr>
+        <w:pStyle w:val="Heading1"/>
+      </w:pPr>
+      <w:r>
+        <w:t>7. Significance</w:t>
       </w:r>
     </w:p>
     <w:p>
@@ -616,36 +1215,28 @@
       </w:r>
     </w:p>
     <w:p>
+      <w:pPr>
+        <w:spacing w:before="120"/>
+        <w:jc w:val="left"/>
+      </w:pPr>
       <w:r>
         <w:rPr>
           <w:b/>
         </w:rPr>
+        <w:t xml:space="preserve">Repository: </w:t>
+      </w:r>
+      <w:r>
         <w:t>https://github.com/samuelgtetteh/ai-cybersecurity-portfolio</w:t>
       </w:r>
     </w:p>
     <w:p>
+      <w:pPr>
+        <w:spacing w:before="200"/>
+        <w:jc w:val="left"/>
+      </w:pPr>
       <w:r>
-        <w:rPr>
-          <w:b w:val="0"/>
-          <w:i w:val="0"/>
-        </w:rPr>
-      </w:r>
-    </w:p>
-    <w:p>
-      <w:r>
-        <w:rPr>
-          <w:b w:val="0"/>
-          <w:i w:val="0"/>
-        </w:rPr>
         <w:t>Date: July 17, 2026</w:t>
-      </w:r>
-    </w:p>
-    <w:p>
-      <w:r>
-        <w:rPr>
-          <w:b w:val="0"/>
-          <w:i w:val="0"/>
-        </w:rPr>
+        <w:br/>
         <w:t>Prepared by: Samuel Gbli Tetteh</w:t>
       </w:r>
     </w:p>
@@ -1022,6 +1613,10 @@
     <w:name w:val="Normal"/>
     <w:qFormat/>
     <w:rsid w:val="00FC693F"/>
+    <w:pPr>
+      <w:spacing w:after="120" w:line="276" w:lineRule="auto"/>
+      <w:jc w:val="both"/>
+    </w:pPr>
     <w:rPr>
       <w:rFonts w:ascii="Calibri" w:hAnsi="Calibri"/>
       <w:sz w:val="22"/>
@@ -1082,15 +1677,15 @@
     <w:pPr>
       <w:keepNext/>
       <w:keepLines/>
-      <w:spacing w:before="480" w:after="0"/>
+      <w:spacing w:before="240" w:after="80"/>
       <w:outlineLvl w:val="0"/>
     </w:pPr>
     <w:rPr>
-      <w:rFonts w:asciiTheme="majorHAnsi" w:eastAsiaTheme="majorEastAsia" w:hAnsiTheme="majorHAnsi" w:cstheme="majorBidi"/>
+      <w:rFonts w:asciiTheme="majorHAnsi" w:eastAsiaTheme="majorEastAsia" w:hAnsiTheme="majorHAnsi" w:cstheme="majorBidi" w:ascii="Calibri" w:hAnsi="Calibri"/>
       <w:b/>
       <w:bCs/>
-      <w:color w:val="365F91" w:themeColor="accent1" w:themeShade="BF"/>
-      <w:sz w:val="28"/>
+      <w:color w:val="1F3864"/>
+      <w:sz w:val="26"/>
       <w:szCs w:val="28"/>
     </w:rPr>
   </w:style>

</xml_diff>